<commit_message>
Update User Requirements Document.docx
</commit_message>
<xml_diff>
--- a/SDLC/User Requirements Document.docx
+++ b/SDLC/User Requirements Document.docx
@@ -206,11 +206,19 @@
           <w:lang w:val="en-GB"/>
         </w:rPr>
       </w:pPr>
-      <w:r>
-        <w:rPr>
-          <w:lang w:val="en-GB"/>
-        </w:rPr>
-        <w:t>Many laboratories currently depend on spreadsheets and manual tracking, which are inefficient and error prone. This leads to issues such as unsafe storage of incompatible materials, unnoticed expiry or degradation, inaccurate stock records, weak traceability for audits, unexpected shortages, and increased administrative workload.</w:t>
+      <w:proofErr w:type="gramStart"/>
+      <w:r>
+        <w:rPr>
+          <w:lang w:val="en-GB"/>
+        </w:rPr>
+        <w:t>Many</w:t>
+      </w:r>
+      <w:proofErr w:type="gramEnd"/>
+      <w:r>
+        <w:rPr>
+          <w:lang w:val="en-GB"/>
+        </w:rPr>
+        <w:t xml:space="preserve"> laboratories currently depend on spreadsheets and manual tracking, which are inefficient and error prone. This leads to issues such as unsafe storage of incompatible materials, unnoticed expiry or degradation, inaccurate stock records, weak traceability for audits, unexpected shortages, and increased administrative workload.</w:t>
       </w:r>
     </w:p>
     <w:p>
@@ -227,7 +235,21 @@
         <w:rPr>
           <w:lang w:val="en-GB"/>
         </w:rPr>
-        <w:t>Chrono Stock addresses these challenges by digitizing inventory management, enforcing safety rules, improving traceability, monitoring material conditions, and using predictive analytics to support proactive stock management. This improves safety, efficiency, compliance, and overall inventory reliability.</w:t>
+        <w:t xml:space="preserve">Chrono Stock addresses these challenges by digitizing inventory management, enforcing safety rules, improving traceability, monitoring material conditions, and using predictive analytics to support </w:t>
+      </w:r>
+      <w:proofErr w:type="gramStart"/>
+      <w:r>
+        <w:rPr>
+          <w:lang w:val="en-GB"/>
+        </w:rPr>
+        <w:t>proactive</w:t>
+      </w:r>
+      <w:proofErr w:type="gramEnd"/>
+      <w:r>
+        <w:rPr>
+          <w:lang w:val="en-GB"/>
+        </w:rPr>
+        <w:t xml:space="preserve"> stock management. This improves safety, efficiency, compliance, and overall inventory reliability.</w:t>
       </w:r>
     </w:p>
     <w:p>
@@ -1571,7 +1593,21 @@
         <w:rPr>
           <w:lang w:val="en-GB"/>
         </w:rPr>
-        <w:t>Introduces analytics and forecasting to support proactive inventory management.</w:t>
+        <w:t xml:space="preserve">Introduces analytics and forecasting to support </w:t>
+      </w:r>
+      <w:proofErr w:type="gramStart"/>
+      <w:r>
+        <w:rPr>
+          <w:lang w:val="en-GB"/>
+        </w:rPr>
+        <w:t>proactive</w:t>
+      </w:r>
+      <w:proofErr w:type="gramEnd"/>
+      <w:r>
+        <w:rPr>
+          <w:lang w:val="en-GB"/>
+        </w:rPr>
+        <w:t xml:space="preserve"> inventory management.</w:t>
       </w:r>
     </w:p>
     <w:p>
@@ -2891,7 +2927,21 @@
         <w:rPr>
           <w:lang w:val="en-GB"/>
         </w:rPr>
-        <w:t>The system must be developed as a standalone internal application, with no dependency on external Laboratory Information Management Systems (LIMS).</w:t>
+        <w:t xml:space="preserve">The system must </w:t>
+      </w:r>
+      <w:proofErr w:type="gramStart"/>
+      <w:r>
+        <w:rPr>
+          <w:lang w:val="en-GB"/>
+        </w:rPr>
+        <w:t>be developed</w:t>
+      </w:r>
+      <w:proofErr w:type="gramEnd"/>
+      <w:r>
+        <w:rPr>
+          <w:lang w:val="en-GB"/>
+        </w:rPr>
+        <w:t xml:space="preserve"> as a standalone internal application, with no dependency on external Laboratory Information Management Systems (LIMS).</w:t>
       </w:r>
     </w:p>
     <w:p>
@@ -2939,11 +2989,25 @@
         </w:rPr>
         <w:t xml:space="preserve"> </w:t>
       </w:r>
-      <w:r>
-        <w:rPr>
-          <w:lang w:val="en-GB"/>
-        </w:rPr>
-        <w:t>is included</w:t>
+      <w:proofErr w:type="gramStart"/>
+      <w:r>
+        <w:rPr>
+          <w:lang w:val="en-GB"/>
+        </w:rPr>
+        <w:t xml:space="preserve">is </w:t>
+      </w:r>
+      <w:r>
+        <w:rPr>
+          <w:lang w:val="en-GB"/>
+        </w:rPr>
+        <w:t>included</w:t>
+      </w:r>
+      <w:proofErr w:type="gramEnd"/>
+      <w:r>
+        <w:rPr>
+          <w:lang w:val="en-GB"/>
+        </w:rPr>
+        <w:t>.</w:t>
       </w:r>
     </w:p>
     <w:p>
@@ -2983,7 +3047,21 @@
         <w:rPr>
           <w:lang w:val="en-GB"/>
         </w:rPr>
-        <w:t>No enterprise-grade authentication (SSO), meaning authentication features are simplified or excluded.</w:t>
+        <w:t xml:space="preserve">No enterprise-grade authentication (SSO), meaning authentication features </w:t>
+      </w:r>
+      <w:proofErr w:type="gramStart"/>
+      <w:r>
+        <w:rPr>
+          <w:lang w:val="en-GB"/>
+        </w:rPr>
+        <w:t>are simplified</w:t>
+      </w:r>
+      <w:proofErr w:type="gramEnd"/>
+      <w:r>
+        <w:rPr>
+          <w:lang w:val="en-GB"/>
+        </w:rPr>
+        <w:t xml:space="preserve"> or excluded.</w:t>
       </w:r>
     </w:p>
     <w:p>
@@ -3053,7 +3131,13 @@
         <w:rPr>
           <w:lang w:val="en-GB"/>
         </w:rPr>
-        <w:t>The system must support laboratory safety compliance rules</w:t>
+        <w:t xml:space="preserve">The system must support laboratory safety compliance </w:t>
+      </w:r>
+      <w:r>
+        <w:rPr>
+          <w:lang w:val="en-GB"/>
+        </w:rPr>
+        <w:t>rules.</w:t>
       </w:r>
     </w:p>
     <w:p>
@@ -3285,7 +3369,13 @@
         <w:rPr>
           <w:lang w:val="en-GB"/>
         </w:rPr>
-        <w:t>The project is strictly time-bound with fixed milestones</w:t>
+        <w:t xml:space="preserve">The project is strictly time-bound with fixed </w:t>
+      </w:r>
+      <w:r>
+        <w:rPr>
+          <w:lang w:val="en-GB"/>
+        </w:rPr>
+        <w:t>milestones.</w:t>
       </w:r>
     </w:p>
     <w:p>
@@ -3305,7 +3395,33 @@
         <w:rPr>
           <w:lang w:val="en-GB"/>
         </w:rPr>
-        <w:t>Development must be completed before September 2026</w:t>
+        <w:t xml:space="preserve">Development must </w:t>
+      </w:r>
+      <w:proofErr w:type="gramStart"/>
+      <w:r>
+        <w:rPr>
+          <w:lang w:val="en-GB"/>
+        </w:rPr>
+        <w:t>be completed</w:t>
+      </w:r>
+      <w:proofErr w:type="gramEnd"/>
+      <w:r>
+        <w:rPr>
+          <w:lang w:val="en-GB"/>
+        </w:rPr>
+        <w:t xml:space="preserve"> before </w:t>
+      </w:r>
+      <w:r>
+        <w:rPr>
+          <w:lang w:val="en-GB"/>
+        </w:rPr>
+        <w:t>mid-</w:t>
+      </w:r>
+      <w:r>
+        <w:rPr>
+          <w:lang w:val="en-GB"/>
+        </w:rPr>
+        <w:t>September 2026</w:t>
       </w:r>
     </w:p>
     <w:p>
@@ -3325,7 +3441,27 @@
         <w:rPr>
           <w:lang w:val="en-GB"/>
         </w:rPr>
-        <w:t>Testing and QA must be completed within 3 weeks after development</w:t>
+        <w:t xml:space="preserve">Testing and QA must </w:t>
+      </w:r>
+      <w:proofErr w:type="gramStart"/>
+      <w:r>
+        <w:rPr>
+          <w:lang w:val="en-GB"/>
+        </w:rPr>
+        <w:t>be completed</w:t>
+      </w:r>
+      <w:proofErr w:type="gramEnd"/>
+      <w:r>
+        <w:rPr>
+          <w:lang w:val="en-GB"/>
+        </w:rPr>
+        <w:t xml:space="preserve"> within 3 weeks after </w:t>
+      </w:r>
+      <w:r>
+        <w:rPr>
+          <w:lang w:val="en-GB"/>
+        </w:rPr>
+        <w:t>development.</w:t>
       </w:r>
     </w:p>
     <w:p>
@@ -3859,7 +3995,23 @@
                 <w:kern w:val="0"/>
                 <w14:ligatures w14:val="none"/>
               </w:rPr>
-              <w:t>100% of all functional requirements (FR-01 to FR-13) must be implemented and successfully tested.</w:t>
+              <w:t>100% of all functional requirements (FR-01 to FR-1</w:t>
+            </w:r>
+            <w:r>
+              <w:rPr>
+                <w:rFonts w:eastAsia="Times New Roman" w:cs="Times New Roman"/>
+                <w:kern w:val="0"/>
+                <w14:ligatures w14:val="none"/>
+              </w:rPr>
+              <w:t>0</w:t>
+            </w:r>
+            <w:r>
+              <w:rPr>
+                <w:rFonts w:eastAsia="Times New Roman" w:cs="Times New Roman"/>
+                <w:kern w:val="0"/>
+                <w14:ligatures w14:val="none"/>
+              </w:rPr>
+              <w:t>) must be implemented and successfully tested.</w:t>
             </w:r>
           </w:p>
         </w:tc>
@@ -4866,76 +5018,17 @@
           </w:p>
         </w:tc>
       </w:tr>
-      <w:tr>
-        <w:tc>
-          <w:tcPr>
-            <w:tcW w:w="0" w:type="auto"/>
-            <w:vMerge/>
-          </w:tcPr>
-          <w:p>
-            <w:pPr>
-              <w:spacing w:line="276" w:lineRule="auto"/>
-              <w:jc w:val="both"/>
-              <w:rPr>
-                <w:rFonts w:eastAsia="Times New Roman" w:cs="Times New Roman"/>
-                <w:kern w:val="0"/>
-                <w14:ligatures w14:val="none"/>
-              </w:rPr>
-            </w:pPr>
-          </w:p>
-        </w:tc>
-        <w:tc>
-          <w:tcPr>
-            <w:tcW w:w="1040" w:type="dxa"/>
-            <w:hideMark/>
-          </w:tcPr>
-          <w:p>
-            <w:pPr>
-              <w:spacing w:line="276" w:lineRule="auto"/>
-              <w:jc w:val="both"/>
-              <w:rPr>
-                <w:rFonts w:eastAsia="Times New Roman" w:cs="Times New Roman"/>
-                <w:kern w:val="0"/>
-                <w14:ligatures w14:val="none"/>
-              </w:rPr>
-            </w:pPr>
-            <w:r>
-              <w:rPr>
-                <w:rFonts w:eastAsia="Times New Roman" w:cs="Times New Roman"/>
-                <w:kern w:val="0"/>
-                <w14:ligatures w14:val="none"/>
-              </w:rPr>
-              <w:t>AC-16</w:t>
-            </w:r>
-          </w:p>
-        </w:tc>
-        <w:tc>
-          <w:tcPr>
-            <w:tcW w:w="6745" w:type="dxa"/>
-            <w:hideMark/>
-          </w:tcPr>
-          <w:p>
-            <w:pPr>
-              <w:spacing w:line="276" w:lineRule="auto"/>
-              <w:jc w:val="both"/>
-              <w:rPr>
-                <w:rFonts w:eastAsia="Times New Roman" w:cs="Times New Roman"/>
-                <w:kern w:val="0"/>
-                <w14:ligatures w14:val="none"/>
-              </w:rPr>
-            </w:pPr>
-            <w:r>
-              <w:rPr>
-                <w:rFonts w:eastAsia="Times New Roman" w:cs="Times New Roman"/>
-                <w:kern w:val="0"/>
-                <w14:ligatures w14:val="none"/>
-              </w:rPr>
-              <w:t>Chemical and biology</w:t>
-            </w:r>
-          </w:p>
-        </w:tc>
-      </w:tr>
     </w:tbl>
+    <w:p>
+      <w:pPr>
+        <w:spacing w:line="276" w:lineRule="auto"/>
+        <w:jc w:val="both"/>
+        <w:rPr>
+          <w:rFonts w:asciiTheme="majorHAnsi" w:hAnsiTheme="majorHAnsi"/>
+          <w:lang w:val="en-GB"/>
+        </w:rPr>
+      </w:pPr>
+    </w:p>
     <w:p>
       <w:pPr>
         <w:pStyle w:val="ListParagraph"/>
@@ -9225,7 +9318,11 @@
     <w:rsid w:val="0013477F"/>
     <w:rsid w:val="00307925"/>
     <w:rsid w:val="00417B1A"/>
+    <w:rsid w:val="007341ED"/>
+    <w:rsid w:val="008D781C"/>
     <w:rsid w:val="00B24C95"/>
+    <w:rsid w:val="00CB0D00"/>
+    <w:rsid w:val="00EA69C5"/>
     <w:rsid w:val="00F26EF8"/>
     <w:rsid w:val="00F43392"/>
   </w:rsids>

</xml_diff>